<commit_message>
EcoDrive-data verschoven van 2017-2019 naar 2023-2025
Alle datums in ecodrive.contract, ecodrive.charge_card_status en
ecodrive.proposition + 6 jaar (agreement_date loopt nu van 2023-07 t/m
2025-12). ecodrive.calendar (2014-2039) dekt dit al en is ongewijzigd.
Database blijft in storage-formaat v1.0.0+ (laadt in duckdb-wasm 1.32).
Casus-document bijgewerkt: 'sinds 2023' en month_id-voorbeeld 202511.

Co-Authored-By: Claude Opus 5.5 <noreply@anthropic.com>
Claude-Session: https://claude.ai/code/session_01Ppy3WLYmeuboanpwRXNtyA
</commit_message>
<xml_diff>
--- a/docs/files/dag1/casus_ecodrive/Casus EcoDrive Innovations.docx
+++ b/docs/files/dag1/casus_ecodrive/Casus EcoDrive Innovations.docx
@@ -103,7 +103,7 @@
         <w:t xml:space="preserve">EcoDrive Innovations</w:t>
       </w:r>
       <w:r>
-        <w:t xml:space="preserve">. EcoDrive is sinds 2017 een pionier in de transitie naar duurzame mobiliteit en levert groene energie-oplossingen: laadpassen voor elektrisch vervoer, laadpalen en slimme oplaadtechnologie. Met een sterke focus op innovatie en klanttevredenheid wil het bedrijf rijden makkelijker, groener en efficiënter maken.</w:t>
+        <w:t xml:space="preserve">. EcoDrive is sinds 2023 een pionier in de transitie naar duurzame mobiliteit en levert groene energie-oplossingen: laadpassen voor elektrisch vervoer, laadpalen en slimme oplaadtechnologie. Met een sterke focus op innovatie en klanttevredenheid wil het bedrijf rijden makkelijker, groener en efficiënter maken.</w:t>
       </w:r>
     </w:p>
     <w:p>
@@ -1049,7 +1049,7 @@
               <w:rPr>
                 <w:rStyle w:val="VerbatimChar"/>
               </w:rPr>
-              <w:t xml:space="preserve">201911</w:t>
+              <w:t xml:space="preserve">202511</w:t>
             </w:r>
             <w:r>
               <w:t xml:space="preserve">), weeknummer en meer.</w:t>

</xml_diff>

<commit_message>
EcoDrive-data een jaar terug: geen start- of statusdatums na vandaag
agreement_date loopt nu van 2022-07 t/m 2024-12; laatste start_date
2026-04-30, laatste statuswijziging 2026-05-04. Eén einddatum valt nog na
vandaag (geplande opzegging). Casus: 'sinds 2022', month_id-voorbeeld 202411.

Co-Authored-By: Claude Opus 5.5 <noreply@anthropic.com>
Claude-Session: https://claude.ai/code/session_01Ppy3WLYmeuboanpwRXNtyA
</commit_message>
<xml_diff>
--- a/docs/files/dag1/casus_ecodrive/Casus EcoDrive Innovations.docx
+++ b/docs/files/dag1/casus_ecodrive/Casus EcoDrive Innovations.docx
@@ -103,7 +103,7 @@
         <w:t xml:space="preserve">EcoDrive Innovations</w:t>
       </w:r>
       <w:r>
-        <w:t xml:space="preserve">. EcoDrive is sinds 2023 een pionier in de transitie naar duurzame mobiliteit en levert groene energie-oplossingen: laadpassen voor elektrisch vervoer, laadpalen en slimme oplaadtechnologie. Met een sterke focus op innovatie en klanttevredenheid wil het bedrijf rijden makkelijker, groener en efficiënter maken.</w:t>
+        <w:t xml:space="preserve">. EcoDrive is sinds 2022 een pionier in de transitie naar duurzame mobiliteit en levert groene energie-oplossingen: laadpassen voor elektrisch vervoer, laadpalen en slimme oplaadtechnologie. Met een sterke focus op innovatie en klanttevredenheid wil het bedrijf rijden makkelijker, groener en efficiënter maken.</w:t>
       </w:r>
     </w:p>
     <w:p>
@@ -1049,7 +1049,7 @@
               <w:rPr>
                 <w:rStyle w:val="VerbatimChar"/>
               </w:rPr>
-              <w:t xml:space="preserve">202511</w:t>
+              <w:t xml:space="preserve">202411</w:t>
             </w:r>
             <w:r>
               <w:t xml:space="preserve">), weeknummer en meer.</w:t>

</xml_diff>

<commit_message>
Casus EcoDrive: tip over het werkblad en afspraak over AI-hulp verwijderd
Co-Authored-By: Claude Opus 5.5 <noreply@anthropic.com>
Claude-Session: https://claude.ai/code/session_01Ppy3WLYmeuboanpwRXNtyA
</commit_message>
<xml_diff>
--- a/docs/files/dag1/casus_ecodrive/Casus EcoDrive Innovations.docx
+++ b/docs/files/dag1/casus_ecodrive/Casus EcoDrive Innovations.docx
@@ -1058,30 +1058,6 @@
         </w:tc>
       </w:tr>
     </w:tbl>
-    <w:p>
-      <w:pPr>
-        <w:pStyle w:val="BodyText"/>
-      </w:pPr>
-      <w:r>
-        <w:t xml:space="preserve">Tip: in het werkblad zie je links alle tabellen met hun kolommen. Met</w:t>
-      </w:r>
-      <w:r>
-        <w:t xml:space="preserve"> </w:t>
-      </w:r>
-      <w:r>
-        <w:rPr>
-          <w:bCs/>
-          <w:b/>
-        </w:rPr>
-        <w:t xml:space="preserve">Maak datamodel</w:t>
-      </w:r>
-      <w:r>
-        <w:t xml:space="preserve"> </w:t>
-      </w:r>
-      <w:r>
-        <w:t xml:space="preserve">(linksonder) teken je dit diagram zelf opnieuw, inclusief de relaties die je database kent.</w:t>
-      </w:r>
-    </w:p>
     <w:bookmarkEnd w:id="24"/>
     <w:bookmarkStart w:id="25" w:name="de-opdracht"/>
     <w:p>
@@ -1198,21 +1174,6 @@
           <w:i/>
         </w:rPr>
         <w:t xml:space="preserve">Bonus: denk na over vervolgstappen en extra analyses die je op basis van je bevindingen zou doen.</w:t>
-      </w:r>
-    </w:p>
-    <w:p>
-      <w:pPr>
-        <w:pStyle w:val="FirstParagraph"/>
-      </w:pPr>
-      <w:r>
-        <w:rPr>
-          <w:bCs/>
-          <w:b/>
-        </w:rPr>
-        <w:t xml:space="preserve">Afspraak over AI-hulp</w:t>
-      </w:r>
-      <w:r>
-        <w:t xml:space="preserve">: een LLM mag je helpen met uitleggen en met foutmeldingen. De queries schrijf je zelf, en elke groep legt straks één query regel voor regel uit.</w:t>
       </w:r>
     </w:p>
     <w:bookmarkEnd w:id="25"/>

</xml_diff>

<commit_message>
Casus EcoDrive: KPI actief/geblokkeerd ook door de tijd heen; uitleg statushistorie
Co-Authored-By: Claude Opus 5.5 <noreply@anthropic.com>
Claude-Session: https://claude.ai/code/session_01Ppy3WLYmeuboanpwRXNtyA
</commit_message>
<xml_diff>
--- a/docs/files/dag1/casus_ecodrive/Casus EcoDrive Innovations.docx
+++ b/docs/files/dag1/casus_ecodrive/Casus EcoDrive Innovations.docx
@@ -927,7 +927,7 @@
               <w:jc w:val="left"/>
             </w:pPr>
             <w:r>
-              <w:t xml:space="preserve">Statushistorie per pas. Een pas moet geactiveerd worden voordat hij werkt, en kan geblokkeerd worden, bijvoorbeeld als de klant vertrekt. De</w:t>
+              <w:t xml:space="preserve">Statushistorie per pas: elke statuswijziging is een regel met start_date en end_date. Een pas moet geactiveerd worden voordat hij werkt, en kan geblokkeerd worden, bijvoorbeeld als de klant vertrekt. De</w:t>
             </w:r>
             <w:r>
               <w:t xml:space="preserve"> </w:t>
@@ -1139,7 +1139,7 @@
         </w:numPr>
       </w:pPr>
       <w:r>
-        <w:t xml:space="preserve">Het aantal actieve versus geblokkeerde laadpassen.</w:t>
+        <w:t xml:space="preserve">Het aantal actieve versus geblokkeerde laadpassen: nu, en hoe zich dat door de tijd heen ontwikkeld heeft.</w:t>
       </w:r>
     </w:p>
     <w:p>

</xml_diff>

<commit_message>
Casus EcoDrive: trend actief/geblokkeerd als makkelijke en moeilijke optie
Makkelijk: statuswijzigingen per maand tellen (GROUP BY op start_date).
Moeilijk: de stand per maandeinde via de kalendertabel, met een tip over de
voorwaarde (start_date <= datum en end_date erna of leeg).

Co-Authored-By: Claude Opus 5.5 <noreply@anthropic.com>
Claude-Session: https://claude.ai/code/session_01Ppy3WLYmeuboanpwRXNtyA
</commit_message>
<xml_diff>
--- a/docs/files/dag1/casus_ecodrive/Casus EcoDrive Innovations.docx
+++ b/docs/files/dag1/casus_ecodrive/Casus EcoDrive Innovations.docx
@@ -1139,7 +1139,70 @@
         </w:numPr>
       </w:pPr>
       <w:r>
-        <w:t xml:space="preserve">Het aantal actieve versus geblokkeerde laadpassen: nu, en hoe zich dat door de tijd heen ontwikkeld heeft.</w:t>
+        <w:t xml:space="preserve">Het aantal actieve versus geblokkeerde laadpassen: nu, en hoe zich dat door de tijd heen ontwikkeld heeft. Kies je niveau:</w:t>
+      </w:r>
+    </w:p>
+    <w:p>
+      <w:pPr>
+        <w:numPr>
+          <w:ilvl w:val="2"/>
+          <w:numId w:val="1002"/>
+        </w:numPr>
+      </w:pPr>
+      <w:r>
+        <w:rPr>
+          <w:bCs/>
+          <w:b/>
+        </w:rPr>
+        <w:t xml:space="preserve">Makkelijk:</w:t>
+      </w:r>
+      <w:r>
+        <w:t xml:space="preserve"> tel per maand hoeveel passen er geactiveerd en hoeveel er geblokkeerd zijn (de statuswijzigingen per maand, op </w:t>
+      </w:r>
+      <w:r>
+        <w:rPr>
+          <w:rStyle w:val="VerbatimChar"/>
+        </w:rPr>
+        <w:t xml:space="preserve">start_date</w:t>
+      </w:r>
+      <w:r>
+        <w:t xml:space="preserve">).</w:t>
+      </w:r>
+    </w:p>
+    <w:p>
+      <w:pPr>
+        <w:numPr>
+          <w:ilvl w:val="2"/>
+          <w:numId w:val="1002"/>
+        </w:numPr>
+      </w:pPr>
+      <w:r>
+        <w:rPr>
+          <w:bCs/>
+          <w:b/>
+        </w:rPr>
+        <w:t xml:space="preserve">Moeilijk (uitdaging):</w:t>
+      </w:r>
+      <w:r>
+        <w:t xml:space="preserve"> laat per maand de stand zien: hoeveel passen waren op de laatste dag van de maand actief, en hoeveel geblokkeerd? Tip: gebruik de kalendertabel; een status geldt op een datum als </w:t>
+      </w:r>
+      <w:r>
+        <w:rPr>
+          <w:rStyle w:val="VerbatimChar"/>
+        </w:rPr>
+        <w:t xml:space="preserve">start_date &lt;= datum</w:t>
+      </w:r>
+      <w:r>
+        <w:t xml:space="preserve"> en </w:t>
+      </w:r>
+      <w:r>
+        <w:rPr>
+          <w:rStyle w:val="VerbatimChar"/>
+        </w:rPr>
+        <w:t xml:space="preserve">end_date</w:t>
+      </w:r>
+      <w:r>
+        <w:t xml:space="preserve"> na die datum ligt of leeg is.</w:t>
       </w:r>
     </w:p>
     <w:p>

</xml_diff>